<commit_message>
Nghiem thu Ngay 6: Hoan thien Bao cao do an toan van chuan OpenXML (DOCX va Markdown)
- Xuat ban tep Bao cao do an Microsoft Word docs/BAO_CAO_DO_AN_XLAS.docx tuan thu 100% quy chuan OpenXML trich xuat tu tai lieu mau docs/Nhom12_BaoCao.docx.

- Dong bo cau truc 8 Chuong chuan muc Bo mon Khoa hoc Du lieu - HUIT va 12 de muc de cuong mon hoc trong docs/BAO_CAO_DO_AN_XLAS.md.

- Nhung truc tiep 5 hinh anh nghien cuu do phan giai cao va 5 bang so lieu thuc nghiem y sinh.

- Nang cap module src/report/docx_builder.py (ReportBuilder) va script scripts/export_report_docx.py.

- Bo sung kich ban kiem chuan scripts/verify_day6_contract.py dat 17/17 tieu chi PASS.

- Danh dau hoan thanh Ngay 6: Ha Manh Truong dat 17/20 [x], Huynh Tam Tri dat 16/19 [x].
</commit_message>
<xml_diff>
--- a/reports/test_docx_verification.docx
+++ b/reports/test_docx_verification.docx
@@ -219,6 +219,7 @@
     <w:p>
       <w:pPr>
         <w:pStyle w:val="Heading1"/>
+        <w:ind w:firstLine="0"/>
       </w:pPr>
       <w:r>
         <w:t>LỜI MỞ ĐẦU</w:t>
@@ -229,12 +230,18 @@
         <w:ind w:firstLine="720"/>
       </w:pPr>
       <w:r>
+        <w:rPr>
+          <w:rFonts w:ascii="Times New Roman" w:hAnsi="Times New Roman"/>
+          <w:i w:val="0"/>
+          <w:sz w:val="26"/>
+        </w:rPr>
         <w:t>Trong kỷ nguyên số hiện nay, xử lý ảnh y tế đóng vai trò then chốt...</w:t>
       </w:r>
     </w:p>
     <w:p>
       <w:pPr>
         <w:pStyle w:val="Heading1"/>
+        <w:ind w:firstLine="0"/>
       </w:pPr>
       <w:r>
         <w:t>CHƯƠNG 1: GIỚI THIỆU ĐỀ TÀI</w:t>
@@ -243,6 +250,7 @@
     <w:p>
       <w:pPr>
         <w:pStyle w:val="Heading2"/>
+        <w:ind w:firstLine="0"/>
       </w:pPr>
       <w:r>
         <w:t>1.1. Bối cảnh nghiên cứu</w:t>
@@ -251,6 +259,7 @@
     <w:p>
       <w:pPr>
         <w:pStyle w:val="Heading3"/>
+        <w:ind w:firstLine="0"/>
       </w:pPr>
       <w:r>
         <w:t>1.1.1. Đặc điểm ảnh MRI sọ não</w:t>
@@ -261,6 +270,11 @@
         <w:ind w:firstLine="720"/>
       </w:pPr>
       <w:r>
+        <w:rPr>
+          <w:rFonts w:ascii="Times New Roman" w:hAnsi="Times New Roman"/>
+          <w:i w:val="0"/>
+          <w:sz w:val="26"/>
+        </w:rPr>
         <w:t>Ảnh cộng hưởng từ MRI cung cấp thông tin mô mềm vượt trội...</w:t>
       </w:r>
     </w:p>
@@ -270,11 +284,17 @@
       </w:pPr>
       <w:r>
         <w:rPr>
+          <w:rFonts w:ascii="Times New Roman" w:hAnsi="Times New Roman"/>
           <w:b/>
+          <w:sz w:val="26"/>
         </w:rPr>
         <w:t xml:space="preserve">• </w:t>
       </w:r>
       <w:r>
+        <w:rPr>
+          <w:rFonts w:ascii="Times New Roman" w:hAnsi="Times New Roman"/>
+          <w:sz w:val="26"/>
+        </w:rPr>
         <w:t>Độ phân giải không gian cao.</w:t>
       </w:r>
     </w:p>
@@ -284,17 +304,24 @@
       </w:pPr>
       <w:r>
         <w:rPr>
+          <w:rFonts w:ascii="Times New Roman" w:hAnsi="Times New Roman"/>
           <w:b/>
+          <w:sz w:val="26"/>
         </w:rPr>
         <w:t xml:space="preserve">• </w:t>
       </w:r>
       <w:r>
+        <w:rPr>
+          <w:rFonts w:ascii="Times New Roman" w:hAnsi="Times New Roman"/>
+          <w:sz w:val="26"/>
+        </w:rPr>
         <w:t>Không gây nhiễm xạ cho bệnh nhân.</w:t>
       </w:r>
     </w:p>
     <w:p>
       <w:pPr>
         <w:spacing w:before="160" w:after="80"/>
+        <w:ind w:firstLine="0"/>
         <w:jc w:val="center"/>
       </w:pPr>
       <w:r>
@@ -311,6 +338,14 @@
         <w:tblW w:type="auto" w:w="0"/>
         <w:jc w:val="center"/>
         <w:tblLook w:firstColumn="1" w:firstRow="1" w:lastColumn="0" w:lastRow="0" w:noHBand="0" w:noVBand="1" w:val="04A0"/>
+        <w:tblBorders>
+          <w:top w:val="single" w:sz="4" w:space="0" w:color="B0B0B0"/>
+          <w:bottom w:val="single" w:sz="4" w:space="0" w:color="B0B0B0"/>
+          <w:insideH w:val="single" w:sz="4" w:space="0" w:color="B0B0B0"/>
+          <w:insideV w:val="single" w:sz="4" w:space="0" w:color="B0B0B0"/>
+          <w:left w:val="none"/>
+          <w:right w:val="none"/>
+        </w:tblBorders>
       </w:tblPr>
       <w:tblGrid>
         <w:gridCol w:w="3024"/>
@@ -322,16 +357,17 @@
           <w:tcPr>
             <w:tcW w:type="dxa" w:w="3969"/>
             <w:tcMar>
-              <w:top w:w="100" w:type="dxa"/>
-              <w:bottom w:w="100" w:type="dxa"/>
-              <w:left w:w="150" w:type="dxa"/>
-              <w:right w:w="150" w:type="dxa"/>
+              <w:top w:w="120" w:type="dxa"/>
+              <w:bottom w:w="120" w:type="dxa"/>
+              <w:left w:w="120" w:type="dxa"/>
+              <w:right w:w="120" w:type="dxa"/>
             </w:tcMar>
-            <w:shd w:val="clear" w:color="auto" w:fill="F2F2F2"/>
+            <w:shd w:val="clear" w:color="auto" w:fill="EAEAEA"/>
           </w:tcPr>
           <w:p>
             <w:pPr>
-              <w:spacing w:before="40" w:after="40"/>
+              <w:spacing w:before="60" w:after="60"/>
+              <w:ind w:firstLine="0"/>
               <w:jc w:val="center"/>
             </w:pPr>
             <w:r/>
@@ -349,16 +385,17 @@
           <w:tcPr>
             <w:tcW w:type="dxa" w:w="2268"/>
             <w:tcMar>
-              <w:top w:w="100" w:type="dxa"/>
-              <w:bottom w:w="100" w:type="dxa"/>
-              <w:left w:w="150" w:type="dxa"/>
-              <w:right w:w="150" w:type="dxa"/>
+              <w:top w:w="120" w:type="dxa"/>
+              <w:bottom w:w="120" w:type="dxa"/>
+              <w:left w:w="120" w:type="dxa"/>
+              <w:right w:w="120" w:type="dxa"/>
             </w:tcMar>
-            <w:shd w:val="clear" w:color="auto" w:fill="F2F2F2"/>
+            <w:shd w:val="clear" w:color="auto" w:fill="EAEAEA"/>
           </w:tcPr>
           <w:p>
             <w:pPr>
-              <w:spacing w:before="40" w:after="40"/>
+              <w:spacing w:before="60" w:after="60"/>
+              <w:ind w:firstLine="0"/>
               <w:jc w:val="center"/>
             </w:pPr>
             <w:r/>
@@ -376,16 +413,17 @@
           <w:tcPr>
             <w:tcW w:type="dxa" w:w="2268"/>
             <w:tcMar>
-              <w:top w:w="100" w:type="dxa"/>
-              <w:bottom w:w="100" w:type="dxa"/>
-              <w:left w:w="150" w:type="dxa"/>
-              <w:right w:w="150" w:type="dxa"/>
+              <w:top w:w="120" w:type="dxa"/>
+              <w:bottom w:w="120" w:type="dxa"/>
+              <w:left w:w="120" w:type="dxa"/>
+              <w:right w:w="120" w:type="dxa"/>
             </w:tcMar>
-            <w:shd w:val="clear" w:color="auto" w:fill="F2F2F2"/>
+            <w:shd w:val="clear" w:color="auto" w:fill="EAEAEA"/>
           </w:tcPr>
           <w:p>
             <w:pPr>
-              <w:spacing w:before="40" w:after="40"/>
+              <w:spacing w:before="60" w:after="60"/>
+              <w:ind w:firstLine="0"/>
               <w:jc w:val="center"/>
             </w:pPr>
             <w:r/>
@@ -407,13 +445,14 @@
             <w:tcMar>
               <w:top w:w="80" w:type="dxa"/>
               <w:bottom w:w="80" w:type="dxa"/>
-              <w:left w:w="120" w:type="dxa"/>
-              <w:right w:w="120" w:type="dxa"/>
+              <w:left w:w="100" w:type="dxa"/>
+              <w:right w:w="100" w:type="dxa"/>
             </w:tcMar>
           </w:tcPr>
           <w:p>
             <w:pPr>
-              <w:spacing w:before="40" w:after="40"/>
+              <w:spacing w:before="50" w:after="50"/>
+              <w:ind w:firstLine="0"/>
               <w:jc w:val="left"/>
             </w:pPr>
             <w:r/>
@@ -432,13 +471,14 @@
             <w:tcMar>
               <w:top w:w="80" w:type="dxa"/>
               <w:bottom w:w="80" w:type="dxa"/>
-              <w:left w:w="120" w:type="dxa"/>
-              <w:right w:w="120" w:type="dxa"/>
+              <w:left w:w="100" w:type="dxa"/>
+              <w:right w:w="100" w:type="dxa"/>
             </w:tcMar>
           </w:tcPr>
           <w:p>
             <w:pPr>
-              <w:spacing w:before="40" w:after="40"/>
+              <w:spacing w:before="50" w:after="50"/>
+              <w:ind w:firstLine="0"/>
               <w:jc w:val="center"/>
             </w:pPr>
             <w:r/>
@@ -457,13 +497,14 @@
             <w:tcMar>
               <w:top w:w="80" w:type="dxa"/>
               <w:bottom w:w="80" w:type="dxa"/>
-              <w:left w:w="120" w:type="dxa"/>
-              <w:right w:w="120" w:type="dxa"/>
+              <w:left w:w="100" w:type="dxa"/>
+              <w:right w:w="100" w:type="dxa"/>
             </w:tcMar>
           </w:tcPr>
           <w:p>
             <w:pPr>
-              <w:spacing w:before="40" w:after="40"/>
+              <w:spacing w:before="50" w:after="50"/>
+              <w:ind w:firstLine="0"/>
               <w:jc w:val="center"/>
             </w:pPr>
             <w:r/>
@@ -484,13 +525,14 @@
             <w:tcMar>
               <w:top w:w="80" w:type="dxa"/>
               <w:bottom w:w="80" w:type="dxa"/>
-              <w:left w:w="120" w:type="dxa"/>
-              <w:right w:w="120" w:type="dxa"/>
+              <w:left w:w="100" w:type="dxa"/>
+              <w:right w:w="100" w:type="dxa"/>
             </w:tcMar>
           </w:tcPr>
           <w:p>
             <w:pPr>
-              <w:spacing w:before="40" w:after="40"/>
+              <w:spacing w:before="50" w:after="50"/>
+              <w:ind w:firstLine="0"/>
               <w:jc w:val="left"/>
             </w:pPr>
             <w:r/>
@@ -509,13 +551,14 @@
             <w:tcMar>
               <w:top w:w="80" w:type="dxa"/>
               <w:bottom w:w="80" w:type="dxa"/>
-              <w:left w:w="120" w:type="dxa"/>
-              <w:right w:w="120" w:type="dxa"/>
+              <w:left w:w="100" w:type="dxa"/>
+              <w:right w:w="100" w:type="dxa"/>
             </w:tcMar>
           </w:tcPr>
           <w:p>
             <w:pPr>
-              <w:spacing w:before="40" w:after="40"/>
+              <w:spacing w:before="50" w:after="50"/>
+              <w:ind w:firstLine="0"/>
               <w:jc w:val="center"/>
             </w:pPr>
             <w:r/>
@@ -534,13 +577,14 @@
             <w:tcMar>
               <w:top w:w="80" w:type="dxa"/>
               <w:bottom w:w="80" w:type="dxa"/>
-              <w:left w:w="120" w:type="dxa"/>
-              <w:right w:w="120" w:type="dxa"/>
+              <w:left w:w="100" w:type="dxa"/>
+              <w:right w:w="100" w:type="dxa"/>
             </w:tcMar>
           </w:tcPr>
           <w:p>
             <w:pPr>
-              <w:spacing w:before="40" w:after="40"/>
+              <w:spacing w:before="50" w:after="50"/>
+              <w:ind w:firstLine="0"/>
               <w:jc w:val="center"/>
             </w:pPr>
             <w:r/>
@@ -564,6 +608,7 @@
     <w:p>
       <w:pPr>
         <w:spacing w:before="120" w:after="40"/>
+        <w:ind w:firstLine="0"/>
         <w:jc w:val="center"/>
       </w:pPr>
       <w:r>
@@ -604,6 +649,7 @@
     <w:p>
       <w:pPr>
         <w:spacing w:before="80" w:after="160"/>
+        <w:ind w:firstLine="0"/>
         <w:jc w:val="center"/>
       </w:pPr>
       <w:r>
@@ -618,6 +664,7 @@
     <w:p>
       <w:pPr>
         <w:pStyle w:val="Heading1"/>
+        <w:ind w:firstLine="0"/>
       </w:pPr>
       <w:r>
         <w:t>TÀI LIỆU THAM KHẢO</w:t>
@@ -630,11 +677,17 @@
       </w:pPr>
       <w:r>
         <w:rPr>
+          <w:rFonts w:ascii="Times New Roman" w:hAnsi="Times New Roman"/>
           <w:b/>
+          <w:sz w:val="26"/>
         </w:rPr>
         <w:t xml:space="preserve">[1] </w:t>
       </w:r>
       <w:r>
+        <w:rPr>
+          <w:rFonts w:ascii="Times New Roman" w:hAnsi="Times New Roman"/>
+          <w:sz w:val="26"/>
+        </w:rPr>
         <w:t>R. C. Gonzalez and R. E. Woods, Digital Image Processing, 4th ed., Pearson, 2018.</w:t>
       </w:r>
     </w:p>

</xml_diff>